<commit_message>
docs: alinea fichas de avance al Marketplace v1.0
</commit_message>
<xml_diff>
--- a/Fase 2/Evidencias Grupales/Ficha_Avance_02_HurryUp_v1.0_Iteracion02_GRUPO06.docx
+++ b/Fase 2/Evidencias Grupales/Ficha_Avance_02_HurryUp_v1.0_Iteracion02_GRUPO06.docx
@@ -279,9 +279,9 @@
                 <w:rFonts w:ascii="Aptos" w:hAnsi="Aptos"/>
                 <w:b w:val="0"/>
                 <w:color w:val="000000"/>
-                <w:sz w:val="17"/>
+                <w:sz w:val="16"/>
               </w:rPr>
-              <w:t>Iteración 02 · v1.0</w:t>
+              <w:t>Iteración 02 · v1.0 Marketplace</w:t>
             </w:r>
           </w:p>
         </w:tc>
@@ -482,9 +482,9 @@
           <w:rFonts w:ascii="Aptos" w:hAnsi="Aptos"/>
           <w:b w:val="0"/>
           <w:color w:val="000000"/>
-          <w:sz w:val="21"/>
+          <w:sz w:val="16"/>
         </w:rPr>
-        <w:t>Registrar una reserva desde el formulario de cliente y comprobar que queda asociada al profesional y aparece en su calendario.</w:t>
+        <w:t>Registrar un nuevo negocio en HurryUp y comprobar que sus datos quedan guardados y aparecen en el Marketplace público.</w:t>
       </w:r>
     </w:p>
     <w:p>
@@ -510,9 +510,9 @@
           <w:rFonts w:ascii="Aptos" w:hAnsi="Aptos"/>
           <w:b w:val="0"/>
           <w:color w:val="000000"/>
-          <w:sz w:val="21"/>
+          <w:sz w:val="16"/>
         </w:rPr>
-        <w:t>Reservas / agenda del profesional (entidad lógica del sistema).</w:t>
+        <w:t>Registro de negocio y datos visibles en el Marketplace: nombre, rubro, ubicación y reseña, según la información disponible.</w:t>
       </w:r>
     </w:p>
     <w:p>
@@ -538,9 +538,9 @@
           <w:rFonts w:ascii="Aptos" w:hAnsi="Aptos"/>
           <w:b w:val="0"/>
           <w:color w:val="000000"/>
-          <w:sz w:val="21"/>
+          <w:sz w:val="16"/>
         </w:rPr>
-        <w:t>La nueva reserva se guarda y se visualiza en el calendario del barbero seleccionado, en la fecha y horario elegidos.</w:t>
+        <w:t>Al registrar un negocio nuevo, el Marketplace lo muestra en el listado con su información. La ficha/modal de portafolio y la carga de fotos se consideran parte pendiente del alcance v1.0.</w:t>
       </w:r>
     </w:p>
     <w:p>
@@ -569,9 +569,9 @@
           <w:rFonts w:ascii="Aptos" w:hAnsi="Aptos"/>
           <w:b w:val="0"/>
           <w:color w:val="000000"/>
-          <w:sz w:val="21"/>
+          <w:sz w:val="16"/>
         </w:rPr>
-        <w:t>La tabla seleccionada deberá contener previamente tres registros de prueba, denominados A, B y C. Durante la demostración, el equipo ingresará desde la aplicación un cuarto registro D. Este nuevo registro deberá almacenarse en la base de datos, activar o participar en un proceso y producir un resultado visible.</w:t>
+        <w:t>Para la demostración se seleccionarán o prepararán tres negocios de prueba A, B y C. Durante la reunión se registrará un negocio D desde HurryUp y se verificará si queda guardado y aparece en la salida del Marketplace. La aparición de negocios existentes ya está disponible; el alta nueva de punta a punta queda por comprobar.</w:t>
       </w:r>
     </w:p>
     <w:tbl>
@@ -722,7 +722,7 @@
                 <w:rFonts w:ascii="Aptos" w:hAnsi="Aptos"/>
                 <w:b w:val="0"/>
                 <w:color w:val="000000"/>
-                <w:sz w:val="18"/>
+                <w:sz w:val="15"/>
               </w:rPr>
               <w:t>Preparación</w:t>
             </w:r>
@@ -756,9 +756,9 @@
                 <w:rFonts w:ascii="Aptos" w:hAnsi="Aptos"/>
                 <w:b w:val="0"/>
                 <w:color w:val="000000"/>
-                <w:sz w:val="18"/>
+                <w:sz w:val="15"/>
               </w:rPr>
-              <w:t>La tabla contiene los registros A, B y C.</w:t>
+              <w:t>Seleccionar o preparar tres negocios de prueba A, B y C.</w:t>
             </w:r>
           </w:p>
         </w:tc>
@@ -790,9 +790,9 @@
                 <w:rFonts w:ascii="Aptos" w:hAnsi="Aptos"/>
                 <w:b w:val="0"/>
                 <w:color w:val="000000"/>
-                <w:sz w:val="16"/>
+                <w:sz w:val="15"/>
               </w:rPr>
-              <w:t>Reservas de prueba A, B y C disponibles en el entorno de demostración; verificar antes de la reunión.</w:t>
+              <w:t>Confirmar que aparecen en el listado actual; si faltan, preparar los datos antes de la demo.</w:t>
             </w:r>
           </w:p>
         </w:tc>
@@ -827,7 +827,7 @@
                 <w:rFonts w:ascii="Aptos" w:hAnsi="Aptos"/>
                 <w:b w:val="0"/>
                 <w:color w:val="000000"/>
-                <w:sz w:val="18"/>
+                <w:sz w:val="15"/>
               </w:rPr>
               <w:t>Entrada</w:t>
             </w:r>
@@ -862,9 +862,9 @@
                 <w:rFonts w:ascii="Aptos" w:hAnsi="Aptos"/>
                 <w:b w:val="0"/>
                 <w:color w:val="000000"/>
-                <w:sz w:val="18"/>
+                <w:sz w:val="15"/>
               </w:rPr>
-              <w:t>El registro D se ingresa desde una pantalla funcional.</w:t>
+              <w:t>Registrar un negocio nuevo D desde el flujo de alta de HurryUp.</w:t>
             </w:r>
           </w:p>
         </w:tc>
@@ -897,9 +897,9 @@
                 <w:rFonts w:ascii="Aptos" w:hAnsi="Aptos"/>
                 <w:b w:val="0"/>
                 <w:color w:val="000000"/>
-                <w:sz w:val="16"/>
+                <w:sz w:val="15"/>
               </w:rPr>
-              <w:t>Formulario de HurryUp con nombre, correo, teléfono, profesional, fecha y horario.</w:t>
+              <w:t>Formulario de alta de negocio; verificar campos disponibles en vivo.</w:t>
             </w:r>
           </w:p>
         </w:tc>
@@ -933,7 +933,7 @@
                 <w:rFonts w:ascii="Aptos" w:hAnsi="Aptos"/>
                 <w:b w:val="0"/>
                 <w:color w:val="000000"/>
-                <w:sz w:val="18"/>
+                <w:sz w:val="15"/>
               </w:rPr>
               <w:t>Proceso</w:t>
             </w:r>
@@ -967,9 +967,9 @@
                 <w:rFonts w:ascii="Aptos" w:hAnsi="Aptos"/>
                 <w:b w:val="0"/>
                 <w:color w:val="000000"/>
-                <w:sz w:val="18"/>
+                <w:sz w:val="15"/>
               </w:rPr>
-              <w:t>La aplicación almacena D y ejecuta la regla definida.</w:t>
+              <w:t>Guardar la información del negocio y actualizar el listado público.</w:t>
             </w:r>
           </w:p>
         </w:tc>
@@ -1001,9 +1001,9 @@
                 <w:rFonts w:ascii="Aptos" w:hAnsi="Aptos"/>
                 <w:b w:val="0"/>
                 <w:color w:val="000000"/>
-                <w:sz w:val="16"/>
+                <w:sz w:val="15"/>
               </w:rPr>
-              <w:t>La aplicación guarda la reserva y la asocia al profesional y horario seleccionados.</w:t>
+              <w:t>Comprobar persistencia y si D aparece sin carga manual adicional.</w:t>
             </w:r>
           </w:p>
         </w:tc>
@@ -1038,9 +1038,9 @@
                 <w:rFonts w:ascii="Aptos" w:hAnsi="Aptos"/>
                 <w:b w:val="0"/>
                 <w:color w:val="000000"/>
-                <w:sz w:val="18"/>
+                <w:sz w:val="15"/>
               </w:rPr>
-              <w:t>Resultado</w:t>
+              <w:t>Salida</w:t>
             </w:r>
           </w:p>
         </w:tc>
@@ -1073,9 +1073,9 @@
                 <w:rFonts w:ascii="Aptos" w:hAnsi="Aptos"/>
                 <w:b w:val="0"/>
                 <w:color w:val="000000"/>
-                <w:sz w:val="18"/>
+                <w:sz w:val="15"/>
               </w:rPr>
-              <w:t>La aplicación muestra un resultado correcto y comprobable.</w:t>
+              <w:t>Visualizar el negocio D en el Marketplace con sus datos disponibles.</w:t>
             </w:r>
           </w:p>
         </w:tc>
@@ -1108,9 +1108,9 @@
                 <w:rFonts w:ascii="Aptos" w:hAnsi="Aptos"/>
                 <w:b w:val="0"/>
                 <w:color w:val="000000"/>
-                <w:sz w:val="16"/>
+                <w:sz w:val="15"/>
               </w:rPr>
-              <w:t>La reserva nueva aparece en el calendario del barbero correspondiente.</w:t>
+              <w:t>La landing ya muestra negocios, ubicación y reseñas; verificar el registro D en demo.</w:t>
             </w:r>
           </w:p>
         </w:tc>
@@ -1317,9 +1317,9 @@
                 <w:rFonts w:ascii="Aptos" w:hAnsi="Aptos"/>
                 <w:b w:val="0"/>
                 <w:color w:val="000000"/>
-                <w:sz w:val="18"/>
+                <w:sz w:val="14"/>
               </w:rPr>
-              <w:t>Tabla con al menos los registros A, B y C</w:t>
+              <w:t>Listado público con negocios A, B y C</w:t>
             </w:r>
           </w:p>
         </w:tc>
@@ -1351,9 +1351,9 @@
                 <w:rFonts w:ascii="Aptos" w:hAnsi="Aptos"/>
                 <w:b w:val="0"/>
                 <w:color w:val="000000"/>
-                <w:sz w:val="16"/>
+                <w:sz w:val="14"/>
               </w:rPr>
-              <w:t>☒ Pendiente  ☐ En curso  ☐ Listo</w:t>
+              <w:t>☐ Pendiente  ☐ En curso  ☒ Listo</w:t>
             </w:r>
           </w:p>
         </w:tc>
@@ -1385,7 +1385,7 @@
                 <w:rFonts w:ascii="Aptos" w:hAnsi="Aptos"/>
                 <w:b w:val="0"/>
                 <w:color w:val="000000"/>
-                <w:sz w:val="16"/>
+                <w:sz w:val="14"/>
               </w:rPr>
               <w:t>Equipo</w:t>
             </w:r>
@@ -1419,9 +1419,9 @@
                 <w:rFonts w:ascii="Aptos" w:hAnsi="Aptos"/>
                 <w:b w:val="0"/>
                 <w:color w:val="000000"/>
-                <w:sz w:val="16"/>
+                <w:sz w:val="14"/>
               </w:rPr>
-              <w:t>HurryUp v1.0 · preparar/verificar datos de prueba A, B y C.</w:t>
+              <w:t>Marketplace HurryUp; listado ya visible según el equipo. Seleccionar tres negocios para la demostración.</w:t>
             </w:r>
           </w:p>
         </w:tc>
@@ -1456,9 +1456,9 @@
                 <w:rFonts w:ascii="Aptos" w:hAnsi="Aptos"/>
                 <w:b w:val="0"/>
                 <w:color w:val="000000"/>
-                <w:sz w:val="18"/>
+                <w:sz w:val="14"/>
               </w:rPr>
-              <w:t>Pantalla conectada y formulario para ingresar D</w:t>
+              <w:t>Formulario para registrar un nuevo negocio D</w:t>
             </w:r>
           </w:p>
         </w:tc>
@@ -1491,9 +1491,9 @@
                 <w:rFonts w:ascii="Aptos" w:hAnsi="Aptos"/>
                 <w:b w:val="0"/>
                 <w:color w:val="000000"/>
-                <w:sz w:val="16"/>
+                <w:sz w:val="14"/>
               </w:rPr>
-              <w:t>☐ Pendiente  ☐ En curso  ☒ Listo</w:t>
+              <w:t>☒ Pendiente  ☐ En curso  ☐ Listo</w:t>
             </w:r>
           </w:p>
         </w:tc>
@@ -1526,7 +1526,7 @@
                 <w:rFonts w:ascii="Aptos" w:hAnsi="Aptos"/>
                 <w:b w:val="0"/>
                 <w:color w:val="000000"/>
-                <w:sz w:val="16"/>
+                <w:sz w:val="14"/>
               </w:rPr>
               <w:t>Equipo</w:t>
             </w:r>
@@ -1561,9 +1561,9 @@
                 <w:rFonts w:ascii="Aptos" w:hAnsi="Aptos"/>
                 <w:b w:val="0"/>
                 <w:color w:val="000000"/>
-                <w:sz w:val="16"/>
+                <w:sz w:val="14"/>
               </w:rPr>
-              <w:t>HurryUp v1.0 · módulo Reservas y calendario del profesional.</w:t>
+              <w:t>Alta de negocio; revisar y demostrar el formulario.</w:t>
             </w:r>
           </w:p>
         </w:tc>
@@ -1597,9 +1597,9 @@
                 <w:rFonts w:ascii="Aptos" w:hAnsi="Aptos"/>
                 <w:b w:val="0"/>
                 <w:color w:val="000000"/>
-                <w:sz w:val="18"/>
+                <w:sz w:val="14"/>
               </w:rPr>
-              <w:t>Validaciones de los datos ingresados</w:t>
+              <w:t>Guardado y publicación automática del negocio D</w:t>
             </w:r>
           </w:p>
         </w:tc>
@@ -1631,9 +1631,9 @@
                 <w:rFonts w:ascii="Aptos" w:hAnsi="Aptos"/>
                 <w:b w:val="0"/>
                 <w:color w:val="000000"/>
-                <w:sz w:val="16"/>
+                <w:sz w:val="14"/>
               </w:rPr>
-              <w:t>☐ Pendiente  ☐ En curso  ☒ Listo</w:t>
+              <w:t>☒ Pendiente  ☐ En curso  ☐ Listo</w:t>
             </w:r>
           </w:p>
         </w:tc>
@@ -1665,7 +1665,7 @@
                 <w:rFonts w:ascii="Aptos" w:hAnsi="Aptos"/>
                 <w:b w:val="0"/>
                 <w:color w:val="000000"/>
-                <w:sz w:val="16"/>
+                <w:sz w:val="14"/>
               </w:rPr>
               <w:t>Equipo</w:t>
             </w:r>
@@ -1699,9 +1699,9 @@
                 <w:rFonts w:ascii="Aptos" w:hAnsi="Aptos"/>
                 <w:b w:val="0"/>
                 <w:color w:val="000000"/>
-                <w:sz w:val="16"/>
+                <w:sz w:val="14"/>
               </w:rPr>
-              <w:t>HurryUp v1.0 · módulo Reservas y calendario del profesional.</w:t>
+              <w:t>Prueba punta a punta pendiente: alta → listado Marketplace.</w:t>
             </w:r>
           </w:p>
         </w:tc>
@@ -1736,9 +1736,9 @@
                 <w:rFonts w:ascii="Aptos" w:hAnsi="Aptos"/>
                 <w:b w:val="0"/>
                 <w:color w:val="000000"/>
-                <w:sz w:val="18"/>
+                <w:sz w:val="14"/>
               </w:rPr>
-              <w:t>Registro D almacenado correctamente</w:t>
+              <w:t>Datos de rubro, dirección y reseña en la ficha pública</w:t>
             </w:r>
           </w:p>
         </w:tc>
@@ -1771,9 +1771,9 @@
                 <w:rFonts w:ascii="Aptos" w:hAnsi="Aptos"/>
                 <w:b w:val="0"/>
                 <w:color w:val="000000"/>
-                <w:sz w:val="16"/>
+                <w:sz w:val="14"/>
               </w:rPr>
-              <w:t>☐ Pendiente  ☐ En curso  ☒ Listo</w:t>
+              <w:t>☐ Pendiente  ☒ En curso  ☐ Listo</w:t>
             </w:r>
           </w:p>
         </w:tc>
@@ -1806,7 +1806,7 @@
                 <w:rFonts w:ascii="Aptos" w:hAnsi="Aptos"/>
                 <w:b w:val="0"/>
                 <w:color w:val="000000"/>
-                <w:sz w:val="16"/>
+                <w:sz w:val="14"/>
               </w:rPr>
               <w:t>Equipo</w:t>
             </w:r>
@@ -1841,9 +1841,9 @@
                 <w:rFonts w:ascii="Aptos" w:hAnsi="Aptos"/>
                 <w:b w:val="0"/>
                 <w:color w:val="000000"/>
-                <w:sz w:val="16"/>
+                <w:sz w:val="14"/>
               </w:rPr>
-              <w:t>HurryUp v1.0 · módulo Reservas y calendario del profesional.</w:t>
+              <w:t>Marketplace actual muestra información del negocio; revisar campos en demo.</w:t>
             </w:r>
           </w:p>
         </w:tc>
@@ -1877,9 +1877,9 @@
                 <w:rFonts w:ascii="Aptos" w:hAnsi="Aptos"/>
                 <w:b w:val="0"/>
                 <w:color w:val="000000"/>
-                <w:sz w:val="18"/>
+                <w:sz w:val="14"/>
               </w:rPr>
-              <w:t>Proceso ejecutado desde la aplicación</w:t>
+              <w:t>Modal de perfil y portafolio de trabajos</w:t>
             </w:r>
           </w:p>
         </w:tc>
@@ -1911,9 +1911,9 @@
                 <w:rFonts w:ascii="Aptos" w:hAnsi="Aptos"/>
                 <w:b w:val="0"/>
                 <w:color w:val="000000"/>
-                <w:sz w:val="16"/>
+                <w:sz w:val="14"/>
               </w:rPr>
-              <w:t>☐ Pendiente  ☐ En curso  ☒ Listo</w:t>
+              <w:t>☒ Pendiente  ☐ En curso  ☐ Listo</w:t>
             </w:r>
           </w:p>
         </w:tc>
@@ -1945,7 +1945,7 @@
                 <w:rFonts w:ascii="Aptos" w:hAnsi="Aptos"/>
                 <w:b w:val="0"/>
                 <w:color w:val="000000"/>
-                <w:sz w:val="16"/>
+                <w:sz w:val="14"/>
               </w:rPr>
               <w:t>Equipo</w:t>
             </w:r>
@@ -1979,9 +1979,9 @@
                 <w:rFonts w:ascii="Aptos" w:hAnsi="Aptos"/>
                 <w:b w:val="0"/>
                 <w:color w:val="000000"/>
-                <w:sz w:val="16"/>
+                <w:sz w:val="14"/>
               </w:rPr>
-              <w:t>HurryUp v1.0 · módulo Reservas y calendario del profesional.</w:t>
+              <w:t>Pendiente de desarrollo; se planifica para la siguiente demostración.</w:t>
             </w:r>
           </w:p>
         </w:tc>
@@ -2016,9 +2016,9 @@
                 <w:rFonts w:ascii="Aptos" w:hAnsi="Aptos"/>
                 <w:b w:val="0"/>
                 <w:color w:val="000000"/>
-                <w:sz w:val="18"/>
+                <w:sz w:val="14"/>
               </w:rPr>
-              <w:t>Resultado visible y comprobado</w:t>
+              <w:t>Carga y visualización de fotografías del portafolio</w:t>
             </w:r>
           </w:p>
         </w:tc>
@@ -2051,9 +2051,9 @@
                 <w:rFonts w:ascii="Aptos" w:hAnsi="Aptos"/>
                 <w:b w:val="0"/>
                 <w:color w:val="000000"/>
-                <w:sz w:val="16"/>
+                <w:sz w:val="14"/>
               </w:rPr>
-              <w:t>☐ Pendiente  ☐ En curso  ☒ Listo</w:t>
+              <w:t>☒ Pendiente  ☐ En curso  ☐ Listo</w:t>
             </w:r>
           </w:p>
         </w:tc>
@@ -2086,7 +2086,7 @@
                 <w:rFonts w:ascii="Aptos" w:hAnsi="Aptos"/>
                 <w:b w:val="0"/>
                 <w:color w:val="000000"/>
-                <w:sz w:val="16"/>
+                <w:sz w:val="14"/>
               </w:rPr>
               <w:t>Equipo</w:t>
             </w:r>
@@ -2121,9 +2121,9 @@
                 <w:rFonts w:ascii="Aptos" w:hAnsi="Aptos"/>
                 <w:b w:val="0"/>
                 <w:color w:val="000000"/>
-                <w:sz w:val="16"/>
+                <w:sz w:val="14"/>
               </w:rPr>
-              <w:t>HurryUp v1.0 · módulo Reservas y calendario del profesional.</w:t>
+              <w:t>Pendiente; validar junto con el modal.</w:t>
             </w:r>
           </w:p>
         </w:tc>
@@ -2258,9 +2258,9 @@
                 <w:rFonts w:ascii="Aptos" w:hAnsi="Aptos"/>
                 <w:b w:val="0"/>
                 <w:color w:val="000000"/>
-                <w:sz w:val="18"/>
+                <w:sz w:val="15"/>
               </w:rPr>
-              <w:t>Tabla principal seleccionada</w:t>
+              <w:t>Datos del registro D</w:t>
             </w:r>
           </w:p>
         </w:tc>
@@ -2292,9 +2292,9 @@
                 <w:rFonts w:ascii="Aptos" w:hAnsi="Aptos"/>
                 <w:b w:val="0"/>
                 <w:color w:val="000000"/>
-                <w:sz w:val="16"/>
+                <w:sz w:val="15"/>
               </w:rPr>
-              <w:t>Reservas y calendario del profesional (entidades lógicas de HurryUp).</w:t>
+              <w:t>Datos comerciales solicitados por el formulario de alta; confirmar los campos exactos durante la demostración.</w:t>
             </w:r>
           </w:p>
         </w:tc>
@@ -2329,9 +2329,9 @@
                 <w:rFonts w:ascii="Aptos" w:hAnsi="Aptos"/>
                 <w:b w:val="0"/>
                 <w:color w:val="000000"/>
-                <w:sz w:val="18"/>
+                <w:sz w:val="15"/>
               </w:rPr>
-              <w:t>Datos del registro D y validaciones</w:t>
+              <w:t>Tabla o entidad principal</w:t>
             </w:r>
           </w:p>
         </w:tc>
@@ -2364,9 +2364,9 @@
                 <w:rFonts w:ascii="Aptos" w:hAnsi="Aptos"/>
                 <w:b w:val="0"/>
                 <w:color w:val="000000"/>
-                <w:sz w:val="16"/>
+                <w:sz w:val="15"/>
               </w:rPr>
-              <w:t>Datos de prueba: nombre, correo y teléfono del cliente; profesional, fecha y horario seleccionados. Verificar los datos antes de guardar.</w:t>
+              <w:t>Negocio / cuenta de negocio en HurryUp; confirmar el nombre técnico en la implementación.</w:t>
             </w:r>
           </w:p>
         </w:tc>
@@ -2400,7 +2400,7 @@
                 <w:rFonts w:ascii="Aptos" w:hAnsi="Aptos"/>
                 <w:b w:val="0"/>
                 <w:color w:val="000000"/>
-                <w:sz w:val="18"/>
+                <w:sz w:val="15"/>
               </w:rPr>
               <w:t>Proceso que se ejecutará</w:t>
             </w:r>
@@ -2434,9 +2434,9 @@
                 <w:rFonts w:ascii="Aptos" w:hAnsi="Aptos"/>
                 <w:b w:val="0"/>
                 <w:color w:val="000000"/>
-                <w:sz w:val="16"/>
+                <w:sz w:val="15"/>
               </w:rPr>
-              <w:t>Registrar la solicitud de hora y asociarla al profesional y horario elegidos.</w:t>
+              <w:t>Guardar la nueva cuenta de negocio y consultar los negocios que se presentan públicamente.</w:t>
             </w:r>
           </w:p>
         </w:tc>
@@ -2471,9 +2471,9 @@
                 <w:rFonts w:ascii="Aptos" w:hAnsi="Aptos"/>
                 <w:b w:val="0"/>
                 <w:color w:val="000000"/>
-                <w:sz w:val="18"/>
+                <w:sz w:val="15"/>
               </w:rPr>
-              <w:t>Resultado que permitirá comprobar el funcionamiento</w:t>
+              <w:t>Salida y comprobación</w:t>
             </w:r>
           </w:p>
         </w:tc>
@@ -2506,9 +2506,9 @@
                 <w:rFonts w:ascii="Aptos" w:hAnsi="Aptos"/>
                 <w:b w:val="0"/>
                 <w:color w:val="000000"/>
-                <w:sz w:val="16"/>
+                <w:sz w:val="15"/>
               </w:rPr>
-              <w:t>La reserva recién ingresada se visualiza en el calendario del barbero elegido con la fecha y hora correctas.</w:t>
+              <w:t>El negocio recién registrado aparece en el Marketplace; contrastar el dato creado con la ficha del listado.</w:t>
             </w:r>
           </w:p>
         </w:tc>
@@ -2787,9 +2787,9 @@
                 <w:rFonts w:ascii="Aptos" w:hAnsi="Aptos"/>
                 <w:b w:val="0"/>
                 <w:color w:val="000000"/>
-                <w:sz w:val="16"/>
+                <w:sz w:val="14"/>
               </w:rPr>
-              <w:t>Preparar tres reservas de prueba A, B y C</w:t>
+              <w:t>Preparar datos A, B y C y revisar el listado actual</w:t>
             </w:r>
           </w:p>
         </w:tc>
@@ -2821,7 +2821,7 @@
                 <w:rFonts w:ascii="Aptos" w:hAnsi="Aptos"/>
                 <w:b w:val="0"/>
                 <w:color w:val="000000"/>
-                <w:sz w:val="16"/>
+                <w:sz w:val="14"/>
               </w:rPr>
               <w:t>Equipo</w:t>
             </w:r>
@@ -2855,7 +2855,7 @@
                 <w:rFonts w:ascii="Aptos" w:hAnsi="Aptos"/>
                 <w:b w:val="0"/>
                 <w:color w:val="000000"/>
-                <w:sz w:val="16"/>
+                <w:sz w:val="14"/>
               </w:rPr>
               <w:t>30/09</w:t>
             </w:r>
@@ -2889,7 +2889,7 @@
                 <w:rFonts w:ascii="Aptos" w:hAnsi="Aptos"/>
                 <w:b w:val="0"/>
                 <w:color w:val="000000"/>
-                <w:sz w:val="16"/>
+                <w:sz w:val="14"/>
               </w:rPr>
               <w:t>01/10</w:t>
             </w:r>
@@ -2923,9 +2923,9 @@
                 <w:rFonts w:ascii="Aptos" w:hAnsi="Aptos"/>
                 <w:b w:val="0"/>
                 <w:color w:val="000000"/>
-                <w:sz w:val="16"/>
+                <w:sz w:val="14"/>
               </w:rPr>
-              <w:t>Pendiente de verificar</w:t>
+              <w:t>En curso</w:t>
             </w:r>
           </w:p>
         </w:tc>
@@ -2957,9 +2957,9 @@
                 <w:rFonts w:ascii="Aptos" w:hAnsi="Aptos"/>
                 <w:b w:val="0"/>
                 <w:color w:val="000000"/>
-                <w:sz w:val="16"/>
+                <w:sz w:val="14"/>
               </w:rPr>
-              <w:t>Entorno de demostración de HurryUp.</w:t>
+              <w:t>Negocios existentes visibles en Marketplace.</w:t>
             </w:r>
           </w:p>
         </w:tc>
@@ -2994,9 +2994,9 @@
                 <w:rFonts w:ascii="Aptos" w:hAnsi="Aptos"/>
                 <w:b w:val="0"/>
                 <w:color w:val="000000"/>
-                <w:sz w:val="16"/>
+                <w:sz w:val="14"/>
               </w:rPr>
-              <w:t>Demostrar ingreso de la reserva D</w:t>
+              <w:t>Registrar el negocio D y comprobar su persistencia</w:t>
             </w:r>
           </w:p>
         </w:tc>
@@ -3029,9 +3029,9 @@
                 <w:rFonts w:ascii="Aptos" w:hAnsi="Aptos"/>
                 <w:b w:val="0"/>
                 <w:color w:val="000000"/>
-                <w:sz w:val="16"/>
+                <w:sz w:val="14"/>
               </w:rPr>
-              <w:t>Equipo</w:t>
+              <w:t>Vicente Heredia / Vicente Bustos</w:t>
             </w:r>
           </w:p>
         </w:tc>
@@ -3064,7 +3064,7 @@
                 <w:rFonts w:ascii="Aptos" w:hAnsi="Aptos"/>
                 <w:b w:val="0"/>
                 <w:color w:val="000000"/>
-                <w:sz w:val="16"/>
+                <w:sz w:val="14"/>
               </w:rPr>
               <w:t>01/10</w:t>
             </w:r>
@@ -3099,7 +3099,7 @@
                 <w:rFonts w:ascii="Aptos" w:hAnsi="Aptos"/>
                 <w:b w:val="0"/>
                 <w:color w:val="000000"/>
-                <w:sz w:val="16"/>
+                <w:sz w:val="14"/>
               </w:rPr>
               <w:t>01/10</w:t>
             </w:r>
@@ -3134,7 +3134,7 @@
                 <w:rFonts w:ascii="Aptos" w:hAnsi="Aptos"/>
                 <w:b w:val="0"/>
                 <w:color w:val="000000"/>
-                <w:sz w:val="16"/>
+                <w:sz w:val="14"/>
               </w:rPr>
               <w:t>Planificada</w:t>
             </w:r>
@@ -3169,9 +3169,9 @@
                 <w:rFonts w:ascii="Aptos" w:hAnsi="Aptos"/>
                 <w:b w:val="0"/>
                 <w:color w:val="000000"/>
-                <w:sz w:val="16"/>
+                <w:sz w:val="14"/>
               </w:rPr>
-              <w:t>Formulario de reservas en HurryUp.</w:t>
+              <w:t>Registro nuevo guardado durante la demo.</w:t>
             </w:r>
           </w:p>
         </w:tc>
@@ -3205,9 +3205,9 @@
                 <w:rFonts w:ascii="Aptos" w:hAnsi="Aptos"/>
                 <w:b w:val="0"/>
                 <w:color w:val="000000"/>
-                <w:sz w:val="16"/>
+                <w:sz w:val="14"/>
               </w:rPr>
-              <w:t>Comprobar persistencia y aparición en calendario</w:t>
+              <w:t>Comprobar que D aparece en el listado con sus datos</w:t>
             </w:r>
           </w:p>
         </w:tc>
@@ -3239,9 +3239,9 @@
                 <w:rFonts w:ascii="Aptos" w:hAnsi="Aptos"/>
                 <w:b w:val="0"/>
                 <w:color w:val="000000"/>
-                <w:sz w:val="16"/>
+                <w:sz w:val="14"/>
               </w:rPr>
-              <w:t>Equipo</w:t>
+              <w:t>Vicente Heredia / Vicente Bustos</w:t>
             </w:r>
           </w:p>
         </w:tc>
@@ -3273,7 +3273,7 @@
                 <w:rFonts w:ascii="Aptos" w:hAnsi="Aptos"/>
                 <w:b w:val="0"/>
                 <w:color w:val="000000"/>
-                <w:sz w:val="16"/>
+                <w:sz w:val="14"/>
               </w:rPr>
               <w:t>01/10</w:t>
             </w:r>
@@ -3307,7 +3307,7 @@
                 <w:rFonts w:ascii="Aptos" w:hAnsi="Aptos"/>
                 <w:b w:val="0"/>
                 <w:color w:val="000000"/>
-                <w:sz w:val="16"/>
+                <w:sz w:val="14"/>
               </w:rPr>
               <w:t>01/10</w:t>
             </w:r>
@@ -3341,7 +3341,7 @@
                 <w:rFonts w:ascii="Aptos" w:hAnsi="Aptos"/>
                 <w:b w:val="0"/>
                 <w:color w:val="000000"/>
-                <w:sz w:val="16"/>
+                <w:sz w:val="14"/>
               </w:rPr>
               <w:t>Planificada</w:t>
             </w:r>
@@ -3375,9 +3375,9 @@
                 <w:rFonts w:ascii="Aptos" w:hAnsi="Aptos"/>
                 <w:b w:val="0"/>
                 <w:color w:val="000000"/>
-                <w:sz w:val="16"/>
+                <w:sz w:val="14"/>
               </w:rPr>
-              <w:t>Calendario del profesional seleccionado.</w:t>
+              <w:t>Salida visible y asociada al negocio recién creado.</w:t>
             </w:r>
           </w:p>
         </w:tc>
@@ -3562,9 +3562,9 @@
                 <w:rFonts w:ascii="Aptos" w:hAnsi="Aptos"/>
                 <w:b w:val="0"/>
                 <w:color w:val="000000"/>
-                <w:sz w:val="18"/>
+                <w:sz w:val="14"/>
               </w:rPr>
-              <w:t>1  Mostrar los registros A, B y C</w:t>
+              <w:t>1. Mostrar los negocios A, B y C en el Marketplace.</w:t>
             </w:r>
           </w:p>
         </w:tc>
@@ -3596,9 +3596,9 @@
                 <w:rFonts w:ascii="Aptos" w:hAnsi="Aptos"/>
                 <w:b w:val="0"/>
                 <w:color w:val="000000"/>
-                <w:sz w:val="16"/>
+                <w:sz w:val="14"/>
               </w:rPr>
-              <w:t>Mostrar las tres reservas de prueba A, B y C en el entorno.</w:t>
+              <w:t>La sección pública ya muestra negocios, dirección y reseña según el equipo; guardar evidencia.</w:t>
             </w:r>
           </w:p>
         </w:tc>
@@ -3630,9 +3630,9 @@
                 <w:rFonts w:ascii="Aptos" w:hAnsi="Aptos"/>
                 <w:b w:val="0"/>
                 <w:color w:val="000000"/>
-                <w:sz w:val="18"/>
+                <w:sz w:val="14"/>
               </w:rPr>
-              <w:t>☐ Logrado  ☐ Parcial  ☐ No logrado</w:t>
+              <w:t>☐ Logrado  ☒ Parcial  ☐ Pendiente</w:t>
             </w:r>
           </w:p>
         </w:tc>
@@ -3667,9 +3667,9 @@
                 <w:rFonts w:ascii="Aptos" w:hAnsi="Aptos"/>
                 <w:b w:val="0"/>
                 <w:color w:val="000000"/>
-                <w:sz w:val="18"/>
+                <w:sz w:val="14"/>
               </w:rPr>
-              <w:t>2  Ingresar el registro D desde la pantalla</w:t>
+              <w:t>2. Registrar un nuevo negocio D.</w:t>
             </w:r>
           </w:p>
         </w:tc>
@@ -3702,9 +3702,9 @@
                 <w:rFonts w:ascii="Aptos" w:hAnsi="Aptos"/>
                 <w:b w:val="0"/>
                 <w:color w:val="000000"/>
-                <w:sz w:val="16"/>
+                <w:sz w:val="14"/>
               </w:rPr>
-              <w:t>Ingresar desde el formulario una nueva reserva D con datos ficticios.</w:t>
+              <w:t>Prueba planificada para la reunión; no se marca hasta ejecutarla.</w:t>
             </w:r>
           </w:p>
         </w:tc>
@@ -3737,9 +3737,9 @@
                 <w:rFonts w:ascii="Aptos" w:hAnsi="Aptos"/>
                 <w:b w:val="0"/>
                 <w:color w:val="000000"/>
-                <w:sz w:val="18"/>
+                <w:sz w:val="14"/>
               </w:rPr>
-              <w:t>☐ Logrado  ☐ Parcial  ☐ No logrado</w:t>
+              <w:t>☐ Logrado  ☐ Parcial  ☒ Pendiente</w:t>
             </w:r>
           </w:p>
         </w:tc>
@@ -3773,9 +3773,9 @@
                 <w:rFonts w:ascii="Aptos" w:hAnsi="Aptos"/>
                 <w:b w:val="0"/>
                 <w:color w:val="000000"/>
-                <w:sz w:val="18"/>
+                <w:sz w:val="14"/>
               </w:rPr>
-              <w:t>3  Validar los datos ingresados</w:t>
+              <w:t>3. Comprobar el guardado de D.</w:t>
             </w:r>
           </w:p>
         </w:tc>
@@ -3807,9 +3807,9 @@
                 <w:rFonts w:ascii="Aptos" w:hAnsi="Aptos"/>
                 <w:b w:val="0"/>
                 <w:color w:val="000000"/>
-                <w:sz w:val="16"/>
+                <w:sz w:val="14"/>
               </w:rPr>
-              <w:t>Revisar los campos ingresados antes de confirmar.</w:t>
+              <w:t>Verificar que los datos ingresados persisten en HurryUp.</w:t>
             </w:r>
           </w:p>
         </w:tc>
@@ -3841,9 +3841,9 @@
                 <w:rFonts w:ascii="Aptos" w:hAnsi="Aptos"/>
                 <w:b w:val="0"/>
                 <w:color w:val="000000"/>
-                <w:sz w:val="18"/>
+                <w:sz w:val="14"/>
               </w:rPr>
-              <w:t>☐ Logrado  ☐ Parcial  ☐ No logrado</w:t>
+              <w:t>☐ Logrado  ☐ Parcial  ☒ Pendiente</w:t>
             </w:r>
           </w:p>
         </w:tc>
@@ -3878,9 +3878,9 @@
                 <w:rFonts w:ascii="Aptos" w:hAnsi="Aptos"/>
                 <w:b w:val="0"/>
                 <w:color w:val="000000"/>
-                <w:sz w:val="18"/>
+                <w:sz w:val="14"/>
               </w:rPr>
-              <w:t>4  Comprobar que D quedó almacenado</w:t>
+              <w:t>4. Comprobar que D aparece en el Marketplace.</w:t>
             </w:r>
           </w:p>
         </w:tc>
@@ -3913,9 +3913,9 @@
                 <w:rFonts w:ascii="Aptos" w:hAnsi="Aptos"/>
                 <w:b w:val="0"/>
                 <w:color w:val="000000"/>
-                <w:sz w:val="16"/>
+                <w:sz w:val="14"/>
               </w:rPr>
-              <w:t>Confirmar que la reserva D queda registrada en HurryUp.</w:t>
+              <w:t>Comparar la cuenta creada con el negocio que aparece en la lista.</w:t>
             </w:r>
           </w:p>
         </w:tc>
@@ -3948,9 +3948,9 @@
                 <w:rFonts w:ascii="Aptos" w:hAnsi="Aptos"/>
                 <w:b w:val="0"/>
                 <w:color w:val="000000"/>
-                <w:sz w:val="18"/>
+                <w:sz w:val="14"/>
               </w:rPr>
-              <w:t>☐ Logrado  ☐ Parcial  ☐ No logrado</w:t>
+              <w:t>☐ Logrado  ☐ Parcial  ☒ Pendiente</w:t>
             </w:r>
           </w:p>
         </w:tc>
@@ -3984,9 +3984,9 @@
                 <w:rFonts w:ascii="Aptos" w:hAnsi="Aptos"/>
                 <w:b w:val="0"/>
                 <w:color w:val="000000"/>
-                <w:sz w:val="18"/>
+                <w:sz w:val="14"/>
               </w:rPr>
-              <w:t>5  Ejecutar el proceso definido</w:t>
+              <w:t>5. Revisar rubro, ubicación y reseña en la salida.</w:t>
             </w:r>
           </w:p>
         </w:tc>
@@ -4018,9 +4018,9 @@
                 <w:rFonts w:ascii="Aptos" w:hAnsi="Aptos"/>
                 <w:b w:val="0"/>
                 <w:color w:val="000000"/>
-                <w:sz w:val="16"/>
+                <w:sz w:val="14"/>
               </w:rPr>
-              <w:t>Ejecutar el flujo de reserva para el profesional y horario seleccionados.</w:t>
+              <w:t>Anotar cuáles de esos datos se muestran para el negocio D.</w:t>
             </w:r>
           </w:p>
         </w:tc>
@@ -4052,9 +4052,9 @@
                 <w:rFonts w:ascii="Aptos" w:hAnsi="Aptos"/>
                 <w:b w:val="0"/>
                 <w:color w:val="000000"/>
-                <w:sz w:val="18"/>
+                <w:sz w:val="14"/>
               </w:rPr>
-              <w:t>☐ Logrado  ☐ Parcial  ☐ No logrado</w:t>
+              <w:t>☐ Logrado  ☐ Parcial  ☒ Pendiente</w:t>
             </w:r>
           </w:p>
         </w:tc>
@@ -4089,9 +4089,9 @@
                 <w:rFonts w:ascii="Aptos" w:hAnsi="Aptos"/>
                 <w:b w:val="0"/>
                 <w:color w:val="000000"/>
-                <w:sz w:val="18"/>
+                <w:sz w:val="14"/>
               </w:rPr>
-              <w:t>6  Mostrar y comprobar el resultado</w:t>
+              <w:t>6. Registrar como pendiente el modal y las fotos si aún no están.</w:t>
             </w:r>
           </w:p>
         </w:tc>
@@ -4124,9 +4124,9 @@
                 <w:rFonts w:ascii="Aptos" w:hAnsi="Aptos"/>
                 <w:b w:val="0"/>
                 <w:color w:val="000000"/>
-                <w:sz w:val="16"/>
+                <w:sz w:val="14"/>
               </w:rPr>
-              <w:t>Mostrar la reserva D en el calendario del barbero y contrastar fecha/hora.</w:t>
+              <w:t>No afirmar como terminado el portafolio antes de probarlo.</w:t>
             </w:r>
           </w:p>
         </w:tc>
@@ -4159,9 +4159,9 @@
                 <w:rFonts w:ascii="Aptos" w:hAnsi="Aptos"/>
                 <w:b w:val="0"/>
                 <w:color w:val="000000"/>
-                <w:sz w:val="18"/>
+                <w:sz w:val="14"/>
               </w:rPr>
-              <w:t>☐ Logrado  ☐ Parcial  ☐ No logrado</w:t>
+              <w:t>☐ Logrado  ☐ Parcial  ☒ Pendiente</w:t>
             </w:r>
           </w:p>
         </w:tc>
@@ -4332,7 +4332,7 @@
                 <w:rFonts w:ascii="Aptos" w:hAnsi="Aptos"/>
                 <w:b w:val="0"/>
                 <w:color w:val="000000"/>
-                <w:sz w:val="18"/>
+                <w:sz w:val="14"/>
               </w:rPr>
               <w:t>¿Qué se completó?</w:t>
             </w:r>
@@ -4366,9 +4366,9 @@
                 <w:rFonts w:ascii="Aptos" w:hAnsi="Aptos"/>
                 <w:b w:val="0"/>
                 <w:color w:val="000000"/>
-                <w:sz w:val="16"/>
+                <w:sz w:val="14"/>
               </w:rPr>
-              <w:t>El flujo de reserva ya funciona en HurryUp v1.0: captura los datos del cliente, registra la solicitud y la muestra en el calendario del profesional.</w:t>
+              <w:t>El Marketplace ya presenta negocios con reseñas y dirección, según lo informado por el equipo.</w:t>
             </w:r>
           </w:p>
         </w:tc>
@@ -4400,7 +4400,7 @@
                 <w:rFonts w:ascii="Aptos" w:hAnsi="Aptos"/>
                 <w:b w:val="0"/>
                 <w:color w:val="000000"/>
-                <w:sz w:val="16"/>
+                <w:sz w:val="14"/>
               </w:rPr>
               <w:t>☒ Logrado  ☐ Parcial  ☐ No logrado</w:t>
             </w:r>
@@ -4437,9 +4437,9 @@
                 <w:rFonts w:ascii="Aptos" w:hAnsi="Aptos"/>
                 <w:b w:val="0"/>
                 <w:color w:val="000000"/>
-                <w:sz w:val="18"/>
+                <w:sz w:val="14"/>
               </w:rPr>
-              <w:t>¿Qué quedó incompleto y cómo se comprobó el resultado?</w:t>
+              <w:t>¿Qué falta comprobar?</w:t>
             </w:r>
           </w:p>
         </w:tc>
@@ -4472,9 +4472,9 @@
                 <w:rFonts w:ascii="Aptos" w:hAnsi="Aptos"/>
                 <w:b w:val="0"/>
                 <w:color w:val="000000"/>
-                <w:sz w:val="16"/>
+                <w:sz w:val="14"/>
               </w:rPr>
-              <w:t>La presentación formal queda pendiente. En la reunión se creará la reserva D y se verificará en el calendario; preparar antes las reservas A, B y C.</w:t>
+              <w:t>El registro de un negocio nuevo y su aparición automática en el listado; la prueba se realizará en la demostración.</w:t>
             </w:r>
           </w:p>
         </w:tc>
@@ -4507,7 +4507,7 @@
                 <w:rFonts w:ascii="Aptos" w:hAnsi="Aptos"/>
                 <w:b w:val="0"/>
                 <w:color w:val="000000"/>
-                <w:sz w:val="16"/>
+                <w:sz w:val="14"/>
               </w:rPr>
               <w:t>☐ Logrado  ☒ Parcial  ☐ No logrado</w:t>
             </w:r>
@@ -4543,7 +4543,7 @@
                 <w:rFonts w:ascii="Aptos" w:hAnsi="Aptos"/>
                 <w:b w:val="0"/>
                 <w:color w:val="000000"/>
-                <w:sz w:val="18"/>
+                <w:sz w:val="14"/>
               </w:rPr>
               <w:t>¿Qué decisión técnica se tomó?</w:t>
             </w:r>
@@ -4577,9 +4577,9 @@
                 <w:rFonts w:ascii="Aptos" w:hAnsi="Aptos"/>
                 <w:b w:val="0"/>
                 <w:color w:val="000000"/>
-                <w:sz w:val="16"/>
+                <w:sz w:val="14"/>
               </w:rPr>
-              <w:t>Reutilizar el módulo de reservas y el calendario ya disponibles en la línea base v1.0.</w:t>
+              <w:t>Usar el alta de negocio como entrada de datos y el Marketplace como salida visible; construir luego el modal y portafolio.</w:t>
             </w:r>
           </w:p>
         </w:tc>
@@ -4611,7 +4611,7 @@
                 <w:rFonts w:ascii="Aptos" w:hAnsi="Aptos"/>
                 <w:b w:val="0"/>
                 <w:color w:val="000000"/>
-                <w:sz w:val="16"/>
+                <w:sz w:val="14"/>
               </w:rPr>
               <w:t>☒ Logrado  ☐ Parcial  ☐ No logrado</w:t>
             </w:r>
@@ -4820,9 +4820,9 @@
                 <w:rFonts w:ascii="Aptos" w:hAnsi="Aptos"/>
                 <w:b w:val="0"/>
                 <w:color w:val="000000"/>
-                <w:sz w:val="16"/>
+                <w:sz w:val="14"/>
               </w:rPr>
-              <w:t>No contar con tres registros de prueba antes de la demostración.</w:t>
+              <w:t>El registro D podría no aparecer automáticamente.</w:t>
             </w:r>
           </w:p>
         </w:tc>
@@ -4854,9 +4854,9 @@
                 <w:rFonts w:ascii="Aptos" w:hAnsi="Aptos"/>
                 <w:b w:val="0"/>
                 <w:color w:val="000000"/>
-                <w:sz w:val="16"/>
+                <w:sz w:val="14"/>
               </w:rPr>
-              <w:t>Dificulta mostrar el registro previo A/B/C y el nuevo D.</w:t>
+              <w:t>No se demostraría el ciclo completo de entrada y salida.</w:t>
             </w:r>
           </w:p>
         </w:tc>
@@ -4888,9 +4888,9 @@
                 <w:rFonts w:ascii="Aptos" w:hAnsi="Aptos"/>
                 <w:b w:val="0"/>
                 <w:color w:val="000000"/>
-                <w:sz w:val="16"/>
+                <w:sz w:val="14"/>
               </w:rPr>
-              <w:t>Preparar reservas ficticias A, B y C y crear D durante la reunión.</w:t>
+              <w:t>Probarlo en vivo; registrar la causa y la tarea pendiente si no se actualiza el listado.</w:t>
             </w:r>
           </w:p>
         </w:tc>
@@ -4922,7 +4922,7 @@
                 <w:rFonts w:ascii="Aptos" w:hAnsi="Aptos"/>
                 <w:b w:val="0"/>
                 <w:color w:val="000000"/>
-                <w:sz w:val="16"/>
+                <w:sz w:val="14"/>
               </w:rPr>
               <w:t>Equipo · 01/10/2026</w:t>
             </w:r>
@@ -5131,9 +5131,9 @@
                 <w:rFonts w:ascii="Aptos" w:hAnsi="Aptos"/>
                 <w:b w:val="0"/>
                 <w:color w:val="000000"/>
-                <w:sz w:val="16"/>
+                <w:sz w:val="14"/>
               </w:rPr>
-              <w:t>Demostrar la salida de datos del flujo de reservas y continuar el Marketplace como mejora v1.3.</w:t>
+              <w:t>Completar el flujo de alta de negocio a su publicación en el Marketplace y avanzar el modal/portafolio.</w:t>
             </w:r>
           </w:p>
         </w:tc>
@@ -5165,7 +5165,7 @@
                 <w:rFonts w:ascii="Aptos" w:hAnsi="Aptos"/>
                 <w:b w:val="0"/>
                 <w:color w:val="000000"/>
-                <w:sz w:val="16"/>
+                <w:sz w:val="14"/>
               </w:rPr>
               <w:t>Vicente Heredia / Vicente Bustos</w:t>
             </w:r>
@@ -5199,7 +5199,7 @@
                 <w:rFonts w:ascii="Aptos" w:hAnsi="Aptos"/>
                 <w:b w:val="0"/>
                 <w:color w:val="000000"/>
-                <w:sz w:val="16"/>
+                <w:sz w:val="14"/>
               </w:rPr>
               <w:t>Semana 3</w:t>
             </w:r>
@@ -5233,9 +5233,9 @@
                 <w:rFonts w:ascii="Aptos" w:hAnsi="Aptos"/>
                 <w:b w:val="0"/>
                 <w:color w:val="000000"/>
-                <w:sz w:val="16"/>
+                <w:sz w:val="14"/>
               </w:rPr>
-              <w:t>La reserva creada se visualiza correctamente; el avance del Marketplace se registra según lo que realmente esté implementado.</w:t>
+              <w:t>Negocio nuevo guardado y visible con sus datos; modal y fotos quedan demostrados solo si efectivamente están implementados.</w:t>
             </w:r>
           </w:p>
         </w:tc>
@@ -5250,9 +5250,9 @@
           <w:rFonts w:ascii="Aptos" w:hAnsi="Aptos"/>
           <w:b/>
           <w:color w:val="000000"/>
-          <w:sz w:val="21"/>
+          <w:sz w:val="16"/>
         </w:rPr>
-        <w:t>Estado general de la iteración:  ☒ Cumplida    ☐ Parcialmente cumplida    ☐ No cumplida</w:t>
+        <w:t>Estado general de la iteración:  ☐ Cumplida    ☒ Parcialmente cumplida    ☐ No cumplida</w:t>
       </w:r>
     </w:p>
     <w:p>

</xml_diff>